<commit_message>
2026-07-12 Sun 1354 Engina
</commit_message>
<xml_diff>
--- a/2026-06-18 Thu 1632 Latest Checkpoint.docx
+++ b/2026-06-18 Thu 1632 Latest Checkpoint.docx
@@ -1906,6 +1906,10 @@
     <w:sdt>
       <w:sdtPr>
         <w:rPr>
+          <w:rFonts w:ascii="Arial" w:eastAsia="Arial" w:hAnsi="Arial" w:cs="Arial"/>
+          <w:color w:val="auto"/>
+          <w:sz w:val="22"/>
+          <w:szCs w:val="22"/>
           <w:lang w:val="en-GB"/>
         </w:rPr>
         <w:id w:val="-448554686"/>
@@ -1916,12 +1920,8 @@
       </w:sdtPr>
       <w:sdtEndPr>
         <w:rPr>
-          <w:rFonts w:ascii="Arial" w:eastAsia="Arial" w:hAnsi="Arial" w:cs="Arial"/>
           <w:b/>
           <w:bCs/>
-          <w:color w:val="auto"/>
-          <w:sz w:val="22"/>
-          <w:szCs w:val="22"/>
         </w:rPr>
       </w:sdtEndPr>
       <w:sdtContent>
@@ -15891,7 +15891,7 @@
         </w:rPr>
         <w:lastRenderedPageBreak/>
         <w:drawing>
-          <wp:inline distT="0" distB="0" distL="0" distR="0" wp14:anchorId="4A06A0FF" wp14:editId="06966F79">
+          <wp:inline distT="0" distB="0" distL="0" distR="0" wp14:anchorId="4A06A0FF" wp14:editId="24E5AA0E">
             <wp:extent cx="5943600" cy="3961130"/>
             <wp:effectExtent l="0" t="0" r="0" b="1270"/>
             <wp:docPr id="709817988" name="Picture 2"/>
@@ -16135,6 +16135,22 @@
         </w:rPr>
         <w:t xml:space="preserve"> connected to GP10, GP11, and GP12, configured with internal pull-up resistors.</w:t>
       </w:r>
+      <w:r>
+        <w:rPr>
+          <w:rFonts w:ascii="Times New Roman" w:hAnsi="Times New Roman" w:cs="Times New Roman"/>
+          <w:sz w:val="24"/>
+          <w:szCs w:val="24"/>
+        </w:rPr>
+        <w:br/>
+      </w:r>
+      <w:r>
+        <w:rPr>
+          <w:rFonts w:ascii="Times New Roman" w:hAnsi="Times New Roman" w:cs="Times New Roman"/>
+          <w:sz w:val="24"/>
+          <w:szCs w:val="24"/>
+        </w:rPr>
+        <w:br/>
+      </w:r>
     </w:p>
     <w:p>
       <w:pPr>
@@ -16157,6 +16173,7 @@
           <w:sz w:val="24"/>
           <w:szCs w:val="24"/>
         </w:rPr>
+        <w:lastRenderedPageBreak/>
         <w:t>Power Distribution</w:t>
       </w:r>
       <w:r>
@@ -16165,17 +16182,52 @@
           <w:sz w:val="24"/>
           <w:szCs w:val="24"/>
         </w:rPr>
-        <w:t xml:space="preserve">: A TP4056 charging and step-up protection module accepts a 3.7V Lithium-Ion cell and outputs a boosted 5V rail connected to VBUS (Pin 40), powering </w:t>
-      </w:r>
-      <w:r>
-        <w:rPr>
-          <w:rFonts w:ascii="Times New Roman" w:hAnsi="Times New Roman" w:cs="Times New Roman"/>
-          <w:sz w:val="24"/>
-          <w:szCs w:val="24"/>
-        </w:rPr>
-        <w:lastRenderedPageBreak/>
-        <w:t>the 5V PIR and ultrasonic sensors. The Pico W provides a regulated 3.3V output (Pin 36) to power the low-voltage soil sensor, DHT22, and SPI TFT display.</w:t>
-      </w:r>
+        <w:t>: A TP4056 charging and step-up protection module accepts a 3.7V Lithium-Ion cell and outputs a boosted 5V rail connected to VBUS (Pin 40), powering the 5V PIR and ultrasonic sensors. The Pico W provides a regulated 3.3V output (Pin 36) to power the low-voltage soil sensor, DHT22, and SPI TFT display.</w:t>
+      </w:r>
+      <w:r>
+        <w:rPr>
+          <w:rFonts w:ascii="Times New Roman" w:hAnsi="Times New Roman" w:cs="Times New Roman"/>
+          <w:sz w:val="24"/>
+          <w:szCs w:val="24"/>
+        </w:rPr>
+        <w:br/>
+      </w:r>
+      <w:r>
+        <w:rPr>
+          <w:rFonts w:ascii="Times New Roman" w:hAnsi="Times New Roman" w:cs="Times New Roman"/>
+          <w:sz w:val="24"/>
+          <w:szCs w:val="24"/>
+        </w:rPr>
+        <w:br/>
+      </w:r>
+    </w:p>
+    <w:p>
+      <w:pPr>
+        <w:pStyle w:val="Heading1"/>
+      </w:pPr>
+    </w:p>
+    <w:p>
+      <w:pPr>
+        <w:pStyle w:val="Heading1"/>
+        <w:rPr>
+          <w:rFonts w:ascii="Times New Roman" w:hAnsi="Times New Roman" w:cs="Times New Roman"/>
+          <w:sz w:val="28"/>
+          <w:szCs w:val="28"/>
+        </w:rPr>
+      </w:pPr>
+      <w:r>
+        <w:rPr>
+          <w:rFonts w:ascii="Times New Roman" w:hAnsi="Times New Roman" w:cs="Times New Roman"/>
+          <w:sz w:val="28"/>
+          <w:szCs w:val="28"/>
+        </w:rPr>
+        <w:t>CHAPTER 4: SYSTEM DESIGN AND PROTOTYPE DEVELOPMENT</w:t>
+      </w:r>
+    </w:p>
+    <w:p>
+      <w:pPr>
+        <w:pStyle w:val="Heading1"/>
+      </w:pPr>
     </w:p>
     <w:p>
       <w:pPr>
@@ -16383,7 +16435,7 @@
         </w:rPr>
         <w:lastRenderedPageBreak/>
         <w:drawing>
-          <wp:inline distT="0" distB="0" distL="0" distR="0" wp14:anchorId="70BD9169" wp14:editId="1B6CF231">
+          <wp:inline distT="0" distB="0" distL="0" distR="0" wp14:anchorId="70BD9169" wp14:editId="6ADFC06B">
             <wp:extent cx="6641209" cy="7429500"/>
             <wp:effectExtent l="0" t="0" r="7620" b="0"/>
             <wp:docPr id="1435734270" name="Picture 1"/>
@@ -16534,7 +16586,7 @@
           <w:szCs w:val="24"/>
         </w:rPr>
         <w:drawing>
-          <wp:inline distT="0" distB="0" distL="0" distR="0" wp14:anchorId="4A382C81" wp14:editId="338F4C40">
+          <wp:inline distT="0" distB="0" distL="0" distR="0" wp14:anchorId="4A382C81" wp14:editId="08E240E1">
             <wp:extent cx="3276600" cy="5986851"/>
             <wp:effectExtent l="0" t="0" r="0" b="0"/>
             <wp:docPr id="687081543" name="Picture 2"/>
@@ -16768,7 +16820,7 @@
           <w:szCs w:val="24"/>
         </w:rPr>
         <w:drawing>
-          <wp:inline distT="0" distB="0" distL="0" distR="0" wp14:anchorId="53A9C491" wp14:editId="53EFDA1C">
+          <wp:inline distT="0" distB="0" distL="0" distR="0" wp14:anchorId="53A9C491" wp14:editId="29504E8D">
             <wp:extent cx="1781580" cy="6753225"/>
             <wp:effectExtent l="0" t="0" r="9525" b="0"/>
             <wp:docPr id="1528382765" name="Picture 4"/>
@@ -32630,7 +32682,6 @@
   <w:style w:type="character" w:default="1" w:styleId="DefaultParagraphFont">
     <w:name w:val="Default Paragraph Font"/>
     <w:uiPriority w:val="1"/>
-    <w:semiHidden/>
     <w:unhideWhenUsed/>
   </w:style>
   <w:style w:type="table" w:default="1" w:styleId="TableNormal">
@@ -33266,28 +33317,28 @@
 </file>
 
 <file path=customXml/item1.xml><?xml version="1.0" encoding="utf-8"?>
-<b:Sources xmlns:b="http://schemas.openxmlformats.org/officeDocument/2006/bibliography" xmlns="http://schemas.openxmlformats.org/officeDocument/2006/bibliography" SelectedStyle="\APASixthEditionOfficeOnline.xsl" StyleName="APA" Version="6"/>
-</file>
-
-<file path=customXml/item2.xml><?xml version="1.0" encoding="utf-8"?>
 <go:gDocsCustomXmlDataStorage xmlns:go="http://customooxmlschemas.google.com/" xmlns:r="http://schemas.openxmlformats.org/officeDocument/2006/relationships" uri="GoogleDocsCustomDataVersion2">
   <go:docsCustomData xmlns:go="http://customooxmlschemas.google.com/" roundtripDataSignature="AMtx7mjZ/iS+BjL6QzwAazxG54noe7eSLQ==">CgMxLjAyDmguaGUyN3NydnYzdTk4Mg5oLm5ldXV3NWN3a21vODIOaC5uYnNpaDc2cDRpc3E4AHIhMTJ3dUxCUkZyUzdETE5SWDcweVhSMW9NRzNnbGJ1Zklv</go:docsCustomData>
 </go:gDocsCustomXmlDataStorage>
 </file>
 
-<file path=customXml/itemProps1.xml><?xml version="1.0" encoding="utf-8"?>
-<ds:datastoreItem xmlns:ds="http://schemas.openxmlformats.org/officeDocument/2006/customXml" ds:itemID="{8F577D1B-6CCE-4FDD-AE57-326F83069298}">
-  <ds:schemaRefs>
-    <ds:schemaRef ds:uri="http://schemas.openxmlformats.org/officeDocument/2006/bibliography"/>
-  </ds:schemaRefs>
-</ds:datastoreItem>
+<file path=customXml/item2.xml><?xml version="1.0" encoding="utf-8"?>
+<b:Sources xmlns:b="http://schemas.openxmlformats.org/officeDocument/2006/bibliography" xmlns="http://schemas.openxmlformats.org/officeDocument/2006/bibliography" SelectedStyle="\APASixthEditionOfficeOnline.xsl" StyleName="APA" Version="6"/>
 </file>
 
-<file path=customXml/itemProps2.xml><?xml version="1.0" encoding="utf-8"?>
+<file path=customXml/itemProps1.xml><?xml version="1.0" encoding="utf-8"?>
 <ds:datastoreItem xmlns:ds="http://schemas.openxmlformats.org/officeDocument/2006/customXml" ds:itemID="{11111111-1234-1234-1234-123412341234}">
   <ds:schemaRefs>
     <ds:schemaRef ds:uri="http://customooxmlschemas.google.com/"/>
     <ds:schemaRef ds:uri="http://schemas.openxmlformats.org/officeDocument/2006/relationships"/>
   </ds:schemaRefs>
 </ds:datastoreItem>
+</file>
+
+<file path=customXml/itemProps2.xml><?xml version="1.0" encoding="utf-8"?>
+<ds:datastoreItem xmlns:ds="http://schemas.openxmlformats.org/officeDocument/2006/customXml" ds:itemID="{8F577D1B-6CCE-4FDD-AE57-326F83069298}">
+  <ds:schemaRefs>
+    <ds:schemaRef ds:uri="http://schemas.openxmlformats.org/officeDocument/2006/bibliography"/>
+  </ds:schemaRefs>
+</ds:datastoreItem>
 </file>
</xml_diff>